<commit_message>
doc: Info sobre la api de google
</commit_message>
<xml_diff>
--- a/Docs-GoCab.docx
+++ b/Docs-GoCab.docx
@@ -124,21 +124,522 @@
     </w:p>
     <w:p>
       <w:pPr>
-        <w:spacing w:after="0" w:line="240" w:lineRule="auto"/>
-        <w:rPr>
-          <w:rFonts w:ascii="Times New Roman" w:eastAsia="Times New Roman" w:hAnsi="Times New Roman" w:cs="Times New Roman"/>
-          <w:kern w:val="0"/>
+        <w:spacing w:before="100" w:beforeAutospacing="1" w:after="100" w:afterAutospacing="1" w:line="240" w:lineRule="auto"/>
+        <w:rPr>
+          <w:rFonts w:ascii="Times New Roman" w:eastAsia="Times New Roman" w:hAnsi="Times New Roman" w:cs="Times New Roman"/>
+          <w:kern w:val="0"/>
+          <w:lang w:eastAsia="es-MX"/>
+          <w14:ligatures w14:val="none"/>
+        </w:rPr>
+      </w:pPr>
+    </w:p>
+    <w:p>
+      <w:pPr>
+        <w:spacing w:before="100" w:beforeAutospacing="1" w:after="100" w:afterAutospacing="1" w:line="240" w:lineRule="auto"/>
+        <w:outlineLvl w:val="2"/>
+        <w:rPr>
+          <w:rFonts w:ascii="Times New Roman" w:eastAsia="Times New Roman" w:hAnsi="Times New Roman" w:cs="Times New Roman"/>
+          <w:b/>
+          <w:bCs/>
+          <w:kern w:val="0"/>
+          <w:sz w:val="27"/>
+          <w:szCs w:val="27"/>
           <w:lang w:eastAsia="es-MX"/>
           <w14:ligatures w14:val="none"/>
         </w:rPr>
       </w:pPr>
       <w:r>
         <w:rPr>
-          <w:noProof/>
-        </w:rPr>
+          <w:rFonts w:ascii="Times New Roman" w:eastAsia="Times New Roman" w:hAnsi="Times New Roman" w:cs="Times New Roman"/>
+          <w:b/>
+          <w:bCs/>
+          <w:kern w:val="0"/>
+          <w:sz w:val="27"/>
+          <w:szCs w:val="27"/>
+          <w:lang w:eastAsia="es-MX"/>
+          <w14:ligatures w14:val="none"/>
+        </w:rPr>
+        <w:t>Configuracion de la IP:</w:t>
+      </w:r>
+    </w:p>
+    <w:p>
+      <w:pPr>
+        <w:spacing w:before="100" w:beforeAutospacing="1" w:after="100" w:afterAutospacing="1" w:line="240" w:lineRule="auto"/>
+        <w:outlineLvl w:val="2"/>
+        <w:rPr>
+          <w:rFonts w:ascii="Times New Roman" w:eastAsia="Times New Roman" w:hAnsi="Times New Roman" w:cs="Times New Roman"/>
+          <w:kern w:val="0"/>
+          <w:lang w:eastAsia="es-MX"/>
+          <w14:ligatures w14:val="none"/>
+        </w:rPr>
+      </w:pPr>
+      <w:r>
+        <w:rPr>
+          <w:rFonts w:ascii="Times New Roman" w:eastAsia="Times New Roman" w:hAnsi="Times New Roman" w:cs="Times New Roman"/>
+          <w:kern w:val="0"/>
+          <w:lang w:eastAsia="es-MX"/>
+          <w14:ligatures w14:val="none"/>
+        </w:rPr>
+        <w:t>Hacer uso de la ipv4 del computador para y configurarlo en el ApiConfig</w:t>
       </w:r>
       <w:r>
-        <w:pict w14:anchorId="4C5019E8">
+        <w:rPr>
+          <w:rFonts w:ascii="Times New Roman" w:eastAsia="Times New Roman" w:hAnsi="Times New Roman" w:cs="Times New Roman"/>
+          <w:b/>
+          <w:bCs/>
+          <w:kern w:val="0"/>
+          <w:sz w:val="27"/>
+          <w:szCs w:val="27"/>
+          <w:lang w:eastAsia="es-MX"/>
+          <w14:ligatures w14:val="none"/>
+        </w:rPr>
+        <w:br/>
+      </w:r>
+      <w:r>
+        <w:rPr>
+          <w:rFonts w:ascii="Times New Roman" w:eastAsia="Times New Roman" w:hAnsi="Times New Roman" w:cs="Times New Roman"/>
+          <w:b/>
+          <w:bCs/>
+          <w:kern w:val="0"/>
+          <w:sz w:val="27"/>
+          <w:szCs w:val="27"/>
+          <w:lang w:eastAsia="es-MX"/>
+          <w14:ligatures w14:val="none"/>
+        </w:rPr>
+        <w:br/>
+        <w:t>Uso del la Google Maps Api Key:</w:t>
+      </w:r>
+      <w:r>
+        <w:rPr>
+          <w:rFonts w:ascii="Times New Roman" w:eastAsia="Times New Roman" w:hAnsi="Times New Roman" w:cs="Times New Roman"/>
+          <w:b/>
+          <w:bCs/>
+          <w:kern w:val="0"/>
+          <w:sz w:val="27"/>
+          <w:szCs w:val="27"/>
+          <w:lang w:eastAsia="es-MX"/>
+          <w14:ligatures w14:val="none"/>
+        </w:rPr>
+        <w:br/>
+      </w:r>
+      <w:r>
+        <w:rPr>
+          <w:rFonts w:ascii="Times New Roman" w:eastAsia="Times New Roman" w:hAnsi="Times New Roman" w:cs="Times New Roman"/>
+          <w:kern w:val="0"/>
+          <w:lang w:eastAsia="es-MX"/>
+          <w14:ligatures w14:val="none"/>
+        </w:rPr>
+        <w:t xml:space="preserve">Se debe </w:t>
+      </w:r>
+      <w:r>
+        <w:rPr>
+          <w:rFonts w:ascii="Times New Roman" w:eastAsia="Times New Roman" w:hAnsi="Times New Roman" w:cs="Times New Roman"/>
+          <w:kern w:val="0"/>
+          <w:lang w:eastAsia="es-MX"/>
+          <w14:ligatures w14:val="none"/>
+        </w:rPr>
+        <w:t>verificar que este habilitadas las funciones :</w:t>
+      </w:r>
+    </w:p>
+    <w:p>
+      <w:pPr>
+        <w:pStyle w:val="Prrafodelista"/>
+        <w:numPr>
+          <w:ilvl w:val="0"/>
+          <w:numId w:val="5"/>
+        </w:numPr>
+        <w:spacing w:before="100" w:beforeAutospacing="1" w:after="100" w:afterAutospacing="1" w:line="240" w:lineRule="auto"/>
+        <w:outlineLvl w:val="2"/>
+        <w:rPr>
+          <w:rFonts w:ascii="Times New Roman" w:eastAsia="Times New Roman" w:hAnsi="Times New Roman" w:cs="Times New Roman"/>
+          <w:kern w:val="0"/>
+          <w:lang w:eastAsia="es-MX"/>
+          <w14:ligatures w14:val="none"/>
+        </w:rPr>
+      </w:pPr>
+      <w:r>
+        <w:rPr>
+          <w:rFonts w:ascii="Times New Roman" w:eastAsia="Times New Roman" w:hAnsi="Times New Roman" w:cs="Times New Roman"/>
+          <w:b/>
+          <w:bCs/>
+          <w:kern w:val="0"/>
+          <w:lang w:eastAsia="es-MX"/>
+          <w14:ligatures w14:val="none"/>
+        </w:rPr>
+        <w:t>Maps SDK for Android</w:t>
+      </w:r>
+      <w:r>
+        <w:rPr>
+          <w:rFonts w:ascii="Times New Roman" w:eastAsia="Times New Roman" w:hAnsi="Times New Roman" w:cs="Times New Roman"/>
+          <w:b/>
+          <w:bCs/>
+          <w:kern w:val="0"/>
+          <w:lang w:eastAsia="es-MX"/>
+          <w14:ligatures w14:val="none"/>
+        </w:rPr>
+        <w:t xml:space="preserve"> –</w:t>
+      </w:r>
+      <w:r>
+        <w:rPr>
+          <w:rFonts w:ascii="Times New Roman" w:eastAsia="Times New Roman" w:hAnsi="Times New Roman" w:cs="Times New Roman"/>
+          <w:kern w:val="0"/>
+          <w:lang w:eastAsia="es-MX"/>
+          <w14:ligatures w14:val="none"/>
+        </w:rPr>
+        <w:t xml:space="preserve"> Para uso del mapa en Android</w:t>
+      </w:r>
+    </w:p>
+    <w:p>
+      <w:pPr>
+        <w:pStyle w:val="Prrafodelista"/>
+        <w:numPr>
+          <w:ilvl w:val="0"/>
+          <w:numId w:val="5"/>
+        </w:numPr>
+        <w:spacing w:before="100" w:beforeAutospacing="1" w:after="100" w:afterAutospacing="1" w:line="240" w:lineRule="auto"/>
+        <w:outlineLvl w:val="2"/>
+        <w:rPr>
+          <w:rFonts w:ascii="Times New Roman" w:eastAsia="Times New Roman" w:hAnsi="Times New Roman" w:cs="Times New Roman"/>
+          <w:kern w:val="0"/>
+          <w:lang w:eastAsia="es-MX"/>
+          <w14:ligatures w14:val="none"/>
+        </w:rPr>
+      </w:pPr>
+      <w:r>
+        <w:rPr>
+          <w:rFonts w:ascii="Times New Roman" w:eastAsia="Times New Roman" w:hAnsi="Times New Roman" w:cs="Times New Roman"/>
+          <w:b/>
+          <w:bCs/>
+          <w:kern w:val="0"/>
+          <w:lang w:eastAsia="es-MX"/>
+          <w14:ligatures w14:val="none"/>
+        </w:rPr>
+        <w:t>Maps SDK for iOS</w:t>
+      </w:r>
+      <w:r>
+        <w:rPr>
+          <w:rFonts w:ascii="Times New Roman" w:eastAsia="Times New Roman" w:hAnsi="Times New Roman" w:cs="Times New Roman"/>
+          <w:b/>
+          <w:bCs/>
+          <w:kern w:val="0"/>
+          <w:lang w:eastAsia="es-MX"/>
+          <w14:ligatures w14:val="none"/>
+        </w:rPr>
+        <w:t xml:space="preserve"> –</w:t>
+      </w:r>
+      <w:r>
+        <w:rPr>
+          <w:rFonts w:ascii="Times New Roman" w:eastAsia="Times New Roman" w:hAnsi="Times New Roman" w:cs="Times New Roman"/>
+          <w:kern w:val="0"/>
+          <w:lang w:eastAsia="es-MX"/>
+          <w14:ligatures w14:val="none"/>
+        </w:rPr>
+        <w:t xml:space="preserve"> Para uso del mapa en iOS</w:t>
+      </w:r>
+    </w:p>
+    <w:p>
+      <w:pPr>
+        <w:pStyle w:val="Prrafodelista"/>
+        <w:numPr>
+          <w:ilvl w:val="0"/>
+          <w:numId w:val="5"/>
+        </w:numPr>
+        <w:spacing w:before="100" w:beforeAutospacing="1" w:after="100" w:afterAutospacing="1" w:line="240" w:lineRule="auto"/>
+        <w:outlineLvl w:val="2"/>
+        <w:rPr>
+          <w:rFonts w:ascii="Times New Roman" w:eastAsia="Times New Roman" w:hAnsi="Times New Roman" w:cs="Times New Roman"/>
+          <w:kern w:val="0"/>
+          <w:lang w:eastAsia="es-MX"/>
+          <w14:ligatures w14:val="none"/>
+        </w:rPr>
+      </w:pPr>
+      <w:r>
+        <w:rPr>
+          <w:rFonts w:ascii="Times New Roman" w:eastAsia="Times New Roman" w:hAnsi="Times New Roman" w:cs="Times New Roman"/>
+          <w:b/>
+          <w:bCs/>
+          <w:kern w:val="0"/>
+          <w:lang w:eastAsia="es-MX"/>
+          <w14:ligatures w14:val="none"/>
+        </w:rPr>
+        <w:t>Places API</w:t>
+      </w:r>
+      <w:r>
+        <w:rPr>
+          <w:rFonts w:ascii="Times New Roman" w:eastAsia="Times New Roman" w:hAnsi="Times New Roman" w:cs="Times New Roman"/>
+          <w:b/>
+          <w:bCs/>
+          <w:kern w:val="0"/>
+          <w:lang w:eastAsia="es-MX"/>
+          <w14:ligatures w14:val="none"/>
+        </w:rPr>
+        <w:t xml:space="preserve"> –</w:t>
+      </w:r>
+      <w:r>
+        <w:rPr>
+          <w:rFonts w:ascii="Times New Roman" w:eastAsia="Times New Roman" w:hAnsi="Times New Roman" w:cs="Times New Roman"/>
+          <w:kern w:val="0"/>
+          <w:lang w:eastAsia="es-MX"/>
+          <w14:ligatures w14:val="none"/>
+        </w:rPr>
+        <w:t xml:space="preserve"> Para obtener la dirección según las cordenadas</w:t>
+      </w:r>
+    </w:p>
+    <w:p>
+      <w:pPr>
+        <w:pStyle w:val="Prrafodelista"/>
+        <w:numPr>
+          <w:ilvl w:val="0"/>
+          <w:numId w:val="5"/>
+        </w:numPr>
+        <w:spacing w:before="100" w:beforeAutospacing="1" w:after="100" w:afterAutospacing="1" w:line="240" w:lineRule="auto"/>
+        <w:outlineLvl w:val="2"/>
+        <w:rPr>
+          <w:rFonts w:ascii="Times New Roman" w:eastAsia="Times New Roman" w:hAnsi="Times New Roman" w:cs="Times New Roman"/>
+          <w:kern w:val="0"/>
+          <w:lang w:eastAsia="es-MX"/>
+          <w14:ligatures w14:val="none"/>
+        </w:rPr>
+      </w:pPr>
+      <w:r>
+        <w:rPr>
+          <w:rFonts w:ascii="Times New Roman" w:eastAsia="Times New Roman" w:hAnsi="Times New Roman" w:cs="Times New Roman"/>
+          <w:b/>
+          <w:bCs/>
+          <w:kern w:val="0"/>
+          <w:lang w:eastAsia="es-MX"/>
+          <w14:ligatures w14:val="none"/>
+        </w:rPr>
+        <w:t>Geocoding API</w:t>
+      </w:r>
+      <w:r>
+        <w:rPr>
+          <w:rFonts w:ascii="Times New Roman" w:eastAsia="Times New Roman" w:hAnsi="Times New Roman" w:cs="Times New Roman"/>
+          <w:b/>
+          <w:bCs/>
+          <w:kern w:val="0"/>
+          <w:lang w:eastAsia="es-MX"/>
+          <w14:ligatures w14:val="none"/>
+        </w:rPr>
+        <w:t xml:space="preserve"> –</w:t>
+      </w:r>
+      <w:r>
+        <w:rPr>
+          <w:rFonts w:ascii="Times New Roman" w:eastAsia="Times New Roman" w:hAnsi="Times New Roman" w:cs="Times New Roman"/>
+          <w:kern w:val="0"/>
+          <w:lang w:eastAsia="es-MX"/>
+          <w14:ligatures w14:val="none"/>
+        </w:rPr>
+        <w:t xml:space="preserve"> Para convertir direcciones en coordenadas</w:t>
+      </w:r>
+    </w:p>
+    <w:p>
+      <w:pPr>
+        <w:pStyle w:val="Prrafodelista"/>
+        <w:numPr>
+          <w:ilvl w:val="0"/>
+          <w:numId w:val="5"/>
+        </w:numPr>
+        <w:spacing w:before="100" w:beforeAutospacing="1" w:after="100" w:afterAutospacing="1" w:line="240" w:lineRule="auto"/>
+        <w:outlineLvl w:val="2"/>
+        <w:rPr>
+          <w:rFonts w:ascii="Times New Roman" w:eastAsia="Times New Roman" w:hAnsi="Times New Roman" w:cs="Times New Roman"/>
+          <w:kern w:val="0"/>
+          <w:lang w:eastAsia="es-MX"/>
+          <w14:ligatures w14:val="none"/>
+        </w:rPr>
+      </w:pPr>
+      <w:r>
+        <w:rPr>
+          <w:rFonts w:ascii="Times New Roman" w:eastAsia="Times New Roman" w:hAnsi="Times New Roman" w:cs="Times New Roman"/>
+          <w:b/>
+          <w:bCs/>
+          <w:kern w:val="0"/>
+          <w:lang w:eastAsia="es-MX"/>
+          <w14:ligatures w14:val="none"/>
+        </w:rPr>
+        <w:t>Distance Matrix API</w:t>
+      </w:r>
+      <w:r>
+        <w:rPr>
+          <w:rFonts w:ascii="Times New Roman" w:eastAsia="Times New Roman" w:hAnsi="Times New Roman" w:cs="Times New Roman"/>
+          <w:b/>
+          <w:bCs/>
+          <w:kern w:val="0"/>
+          <w:lang w:eastAsia="es-MX"/>
+          <w14:ligatures w14:val="none"/>
+        </w:rPr>
+        <w:t xml:space="preserve"> -</w:t>
+      </w:r>
+      <w:r>
+        <w:rPr>
+          <w:rFonts w:ascii="Times New Roman" w:eastAsia="Times New Roman" w:hAnsi="Times New Roman" w:cs="Times New Roman"/>
+          <w:kern w:val="0"/>
+          <w:lang w:eastAsia="es-MX"/>
+          <w14:ligatures w14:val="none"/>
+        </w:rPr>
+        <w:t xml:space="preserve">  Para obtener tiempo y distancia de una ubicación a otra</w:t>
+      </w:r>
+    </w:p>
+    <w:p>
+      <w:pPr>
+        <w:pStyle w:val="Prrafodelista"/>
+        <w:numPr>
+          <w:ilvl w:val="0"/>
+          <w:numId w:val="5"/>
+        </w:numPr>
+        <w:spacing w:before="100" w:beforeAutospacing="1" w:after="100" w:afterAutospacing="1" w:line="240" w:lineRule="auto"/>
+        <w:outlineLvl w:val="2"/>
+        <w:rPr>
+          <w:rFonts w:ascii="Times New Roman" w:eastAsia="Times New Roman" w:hAnsi="Times New Roman" w:cs="Times New Roman"/>
+          <w:kern w:val="0"/>
+          <w:lang w:eastAsia="es-MX"/>
+          <w14:ligatures w14:val="none"/>
+        </w:rPr>
+      </w:pPr>
+      <w:r>
+        <w:rPr>
+          <w:rFonts w:ascii="Times New Roman" w:eastAsia="Times New Roman" w:hAnsi="Times New Roman" w:cs="Times New Roman"/>
+          <w:b/>
+          <w:bCs/>
+          <w:kern w:val="0"/>
+          <w:lang w:eastAsia="es-MX"/>
+          <w14:ligatures w14:val="none"/>
+        </w:rPr>
+        <w:t>Places API –</w:t>
+      </w:r>
+      <w:r>
+        <w:rPr>
+          <w:rFonts w:ascii="Times New Roman" w:eastAsia="Times New Roman" w:hAnsi="Times New Roman" w:cs="Times New Roman"/>
+          <w:kern w:val="0"/>
+          <w:lang w:eastAsia="es-MX"/>
+          <w14:ligatures w14:val="none"/>
+        </w:rPr>
+        <w:t xml:space="preserve"> Para tener un input el cual recomendara ubicaciones según lo escrito</w:t>
+      </w:r>
+    </w:p>
+    <w:p>
+      <w:pPr>
+        <w:pStyle w:val="Prrafodelista"/>
+        <w:numPr>
+          <w:ilvl w:val="0"/>
+          <w:numId w:val="5"/>
+        </w:numPr>
+        <w:spacing w:before="100" w:beforeAutospacing="1" w:after="100" w:afterAutospacing="1" w:line="240" w:lineRule="auto"/>
+        <w:outlineLvl w:val="2"/>
+        <w:rPr>
+          <w:rFonts w:ascii="Times New Roman" w:eastAsia="Times New Roman" w:hAnsi="Times New Roman" w:cs="Times New Roman"/>
+          <w:kern w:val="0"/>
+          <w:lang w:eastAsia="es-MX"/>
+          <w14:ligatures w14:val="none"/>
+        </w:rPr>
+      </w:pPr>
+      <w:r>
+        <w:rPr>
+          <w:rFonts w:ascii="Times New Roman" w:eastAsia="Times New Roman" w:hAnsi="Times New Roman" w:cs="Times New Roman"/>
+          <w:b/>
+          <w:bCs/>
+          <w:kern w:val="0"/>
+          <w:lang w:eastAsia="es-MX"/>
+          <w14:ligatures w14:val="none"/>
+        </w:rPr>
+        <w:t>Places API (New)</w:t>
+      </w:r>
+      <w:r>
+        <w:rPr>
+          <w:rFonts w:ascii="Times New Roman" w:eastAsia="Times New Roman" w:hAnsi="Times New Roman" w:cs="Times New Roman"/>
+          <w:b/>
+          <w:bCs/>
+          <w:kern w:val="0"/>
+          <w:lang w:eastAsia="es-MX"/>
+          <w14:ligatures w14:val="none"/>
+        </w:rPr>
+        <w:t xml:space="preserve"> -</w:t>
+      </w:r>
+      <w:r>
+        <w:rPr>
+          <w:rFonts w:ascii="Times New Roman" w:eastAsia="Times New Roman" w:hAnsi="Times New Roman" w:cs="Times New Roman"/>
+          <w:kern w:val="0"/>
+          <w:lang w:eastAsia="es-MX"/>
+          <w14:ligatures w14:val="none"/>
+        </w:rPr>
+        <w:t xml:space="preserve"> </w:t>
+      </w:r>
+      <w:r>
+        <w:rPr>
+          <w:rFonts w:ascii="Times New Roman" w:eastAsia="Times New Roman" w:hAnsi="Times New Roman" w:cs="Times New Roman"/>
+          <w:kern w:val="0"/>
+          <w:lang w:eastAsia="es-MX"/>
+          <w14:ligatures w14:val="none"/>
+        </w:rPr>
+        <w:t>Para tener un input el cual recomendara ubicaciones según lo escrito</w:t>
+      </w:r>
+    </w:p>
+    <w:p>
+      <w:pPr>
+        <w:pStyle w:val="Prrafodelista"/>
+        <w:numPr>
+          <w:ilvl w:val="0"/>
+          <w:numId w:val="5"/>
+        </w:numPr>
+        <w:spacing w:before="100" w:beforeAutospacing="1" w:after="100" w:afterAutospacing="1" w:line="240" w:lineRule="auto"/>
+        <w:outlineLvl w:val="2"/>
+        <w:rPr>
+          <w:rFonts w:ascii="Times New Roman" w:eastAsia="Times New Roman" w:hAnsi="Times New Roman" w:cs="Times New Roman"/>
+          <w:kern w:val="0"/>
+          <w:lang w:eastAsia="es-MX"/>
+          <w14:ligatures w14:val="none"/>
+        </w:rPr>
+      </w:pPr>
+      <w:r>
+        <w:rPr>
+          <w:rFonts w:ascii="Times New Roman" w:eastAsia="Times New Roman" w:hAnsi="Times New Roman" w:cs="Times New Roman"/>
+          <w:b/>
+          <w:bCs/>
+          <w:kern w:val="0"/>
+          <w:lang w:eastAsia="es-MX"/>
+          <w14:ligatures w14:val="none"/>
+        </w:rPr>
+        <w:t>Directions API</w:t>
+      </w:r>
+      <w:r>
+        <w:rPr>
+          <w:rFonts w:ascii="Times New Roman" w:eastAsia="Times New Roman" w:hAnsi="Times New Roman" w:cs="Times New Roman"/>
+          <w:kern w:val="0"/>
+          <w:lang w:eastAsia="es-MX"/>
+          <w14:ligatures w14:val="none"/>
+        </w:rPr>
+        <w:t xml:space="preserve"> – Para obtener la ruta de una ubicación a otra</w:t>
+      </w:r>
+    </w:p>
+    <w:p>
+      <w:pPr>
+        <w:spacing w:before="100" w:beforeAutospacing="1" w:after="100" w:afterAutospacing="1" w:line="240" w:lineRule="auto"/>
+        <w:rPr>
+          <w:rFonts w:ascii="Times New Roman" w:eastAsia="Times New Roman" w:hAnsi="Times New Roman" w:cs="Times New Roman"/>
+          <w:kern w:val="0"/>
+          <w:lang w:eastAsia="es-MX"/>
+          <w14:ligatures w14:val="none"/>
+        </w:rPr>
+      </w:pPr>
+    </w:p>
+    <w:p>
+      <w:pPr>
+        <w:spacing w:after="0" w:line="240" w:lineRule="auto"/>
+        <w:rPr>
+          <w:rFonts w:ascii="Times New Roman" w:eastAsia="Times New Roman" w:hAnsi="Times New Roman" w:cs="Times New Roman"/>
+          <w:kern w:val="0"/>
+          <w:lang w:eastAsia="es-MX"/>
+          <w14:ligatures w14:val="none"/>
+        </w:rPr>
+      </w:pPr>
+      <w:r>
+        <w:rPr>
+          <w:noProof/>
+        </w:rPr>
+      </w:r>
+      <w:r>
+        <w:pict w14:anchorId="514094FB">
           <v:rect id="Horizontal Line 25" o:spid="_x0000_s1027" style="width:441.9pt;height:.1pt;visibility:visible;mso-wrap-style:square;mso-left-percent:-10001;mso-top-percent:-10001;mso-position-horizontal:absolute;mso-position-horizontal-relative:char;mso-position-vertical:absolute;mso-position-vertical-relative:line;mso-left-percent:-10001;mso-top-percent:-10001;v-text-anchor:top" o:gfxdata="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" filled="f">
             <o:lock v:ext="edit" rotation="t" aspectratio="t" verticies="t" text="t" shapetype="t"/>
             <w10:anchorlock/>
@@ -1769,7 +2270,6 @@
                 <w:lang w:eastAsia="es-MX"/>
                 <w14:ligatures w14:val="none"/>
               </w:rPr>
-              <w:lastRenderedPageBreak/>
               <w:t>GET</w:t>
             </w:r>
           </w:p>
@@ -2757,6 +3257,7 @@
                 <w:lang w:eastAsia="es-MX"/>
                 <w14:ligatures w14:val="none"/>
               </w:rPr>
+              <w:lastRenderedPageBreak/>
               <w:t>GET</w:t>
             </w:r>
           </w:p>
@@ -3634,7 +4135,6 @@
           <w:lang w:eastAsia="es-MX"/>
           <w14:ligatures w14:val="none"/>
         </w:rPr>
-        <w:lastRenderedPageBreak/>
         <w:t>Ofertas del los conductores a las solicitudes de los clientes</w:t>
       </w:r>
     </w:p>
@@ -4604,6 +5104,7 @@
                 <w:lang w:eastAsia="es-MX"/>
                 <w14:ligatures w14:val="none"/>
               </w:rPr>
+              <w:lastRenderedPageBreak/>
               <w:t xml:space="preserve">"idDriver": 10 </w:t>
             </w:r>
           </w:p>
@@ -4648,7 +5149,18 @@
                 <w:lang w:eastAsia="es-MX"/>
                 <w14:ligatures w14:val="none"/>
               </w:rPr>
-              <w:t>Cliente aceptó oferta → conductor asignado</w:t>
+              <w:lastRenderedPageBreak/>
+              <w:t xml:space="preserve">Cliente aceptó oferta → </w:t>
+            </w:r>
+            <w:r>
+              <w:rPr>
+                <w:rFonts w:ascii="Times New Roman" w:eastAsia="Times New Roman" w:hAnsi="Times New Roman" w:cs="Times New Roman"/>
+                <w:kern w:val="0"/>
+                <w:lang w:eastAsia="es-MX"/>
+                <w14:ligatures w14:val="none"/>
+              </w:rPr>
+              <w:lastRenderedPageBreak/>
+              <w:t>conductor asignado</w:t>
             </w:r>
           </w:p>
         </w:tc>
@@ -4675,6 +5187,7 @@
                 <w:lang w:eastAsia="es-MX"/>
                 <w14:ligatures w14:val="none"/>
               </w:rPr>
+              <w:lastRenderedPageBreak/>
               <w:t>change_driver_position</w:t>
             </w:r>
           </w:p>
@@ -5335,7 +5848,6 @@
           <w:lang w:eastAsia="es-MX"/>
           <w14:ligatures w14:val="none"/>
         </w:rPr>
-        <w:lastRenderedPageBreak/>
         <w:t xml:space="preserve">BASE DE DATOS </w:t>
       </w:r>
     </w:p>
@@ -5910,6 +6422,7 @@
           <w:lang w:eastAsia="es-MX"/>
           <w14:ligatures w14:val="none"/>
         </w:rPr>
+        <w:lastRenderedPageBreak/>
         <w:drawing>
           <wp:inline distT="0" distB="0" distL="0" distR="0" wp14:anchorId="00CAAD3C" wp14:editId="00E7B1DC">
             <wp:extent cx="5612130" cy="3968750"/>
@@ -6051,7 +6564,7 @@
         </w:rPr>
       </w:r>
       <w:r>
-        <w:pict w14:anchorId="12E06934">
+        <w:pict w14:anchorId="78BD9243">
           <v:rect id="Horizontal Line 12" o:spid="_x0000_s1026" style="width:441.9pt;height:.1pt;visibility:visible;mso-wrap-style:square;mso-left-percent:-10001;mso-top-percent:-10001;mso-position-horizontal:absolute;mso-position-horizontal-relative:char;mso-position-vertical:absolute;mso-position-vertical-relative:line;mso-left-percent:-10001;mso-top-percent:-10001;v-text-anchor:top" o:gfxdata="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" filled="f">
             <o:lock v:ext="edit" rotation="t" aspectratio="t" verticies="t" text="t" shapetype="t"/>
             <w10:anchorlock/>
@@ -6270,6 +6783,119 @@
 <file path=word/numbering.xml><?xml version="1.0" encoding="utf-8"?>
 <w:numbering xmlns:wpc="http://schemas.microsoft.com/office/word/2010/wordprocessingCanvas" xmlns:cx="http://schemas.microsoft.com/office/drawing/2014/chartex" xmlns:cx1="http://schemas.microsoft.com/office/drawing/2015/9/8/chartex" xmlns:cx2="http://schemas.microsoft.com/office/drawing/2015/10/21/chartex" xmlns:cx3="http://schemas.microsoft.com/office/drawing/2016/5/9/chartex" xmlns:cx4="http://schemas.microsoft.com/office/drawing/2016/5/10/chartex" xmlns:cx5="http://schemas.microsoft.com/office/drawing/2016/5/11/chartex" xmlns:cx6="http://schemas.microsoft.com/office/drawing/2016/5/12/chartex" xmlns:cx7="http://schemas.microsoft.com/office/drawing/2016/5/13/chartex" xmlns:cx8="http://schemas.microsoft.com/office/drawing/2016/5/14/chartex" xmlns:mc="http://schemas.openxmlformats.org/markup-compatibility/2006" xmlns:aink="http://schemas.microsoft.com/office/drawing/2016/ink" xmlns:am3d="http://schemas.microsoft.com/office/drawing/2017/model3d" xmlns:o="urn:schemas-microsoft-com:office:office" xmlns:oel="http://schemas.microsoft.com/office/2019/extlst" xmlns:r="http://schemas.openxmlformats.org/officeDocument/2006/relationships" xmlns:m="http://schemas.openxmlformats.org/officeDocument/2006/math" xmlns:v="urn:schemas-microsoft-com:vml" xmlns:wp14="http://schemas.microsoft.com/office/word/2010/wordprocessingDrawing" xmlns:wp="http://schemas.openxmlformats.org/drawingml/2006/wordprocessingDrawing" xmlns:w10="urn:schemas-microsoft-com:office:word" xmlns:w="http://schemas.openxmlformats.org/wordprocessingml/2006/main" xmlns:w14="http://schemas.microsoft.com/office/word/2010/wordml" xmlns:w15="http://schemas.microsoft.com/office/word/2012/wordml" xmlns:w16cex="http://schemas.microsoft.com/office/word/2018/wordml/cex" xmlns:w16cid="http://schemas.microsoft.com/office/word/2016/wordml/cid" xmlns:w16="http://schemas.microsoft.com/office/word/2018/wordml" xmlns:w16du="http://schemas.microsoft.com/office/word/2023/wordml/word16du" xmlns:w16sdtdh="http://schemas.microsoft.com/office/word/2020/wordml/sdtdatahash" xmlns:w16sdtfl="http://schemas.microsoft.com/office/word/2024/wordml/sdtformatlock" xmlns:w16se="http://schemas.microsoft.com/office/word/2015/wordml/symex" xmlns:wpg="http://schemas.microsoft.com/office/word/2010/wordprocessingGroup" xmlns:wpi="http://schemas.microsoft.com/office/word/2010/wordprocessingInk" xmlns:wne="http://schemas.microsoft.com/office/word/2006/wordml" xmlns:wps="http://schemas.microsoft.com/office/word/2010/wordprocessingShape" mc:Ignorable="w14 w15 w16se w16cid w16 w16cex w16sdtdh w16sdtfl w16du wp14">
   <w:abstractNum w:abstractNumId="0" w15:restartNumberingAfterBreak="0">
+    <w:nsid w:val="02CB4518"/>
+    <w:multiLevelType w:val="hybridMultilevel"/>
+    <w:tmpl w:val="E50C99D4"/>
+    <w:lvl w:ilvl="0" w:tplc="080A0001">
+      <w:start w:val="1"/>
+      <w:numFmt w:val="bullet"/>
+      <w:lvlText w:val=""/>
+      <w:lvlJc w:val="left"/>
+      <w:pPr>
+        <w:ind w:left="720" w:hanging="360"/>
+      </w:pPr>
+      <w:rPr>
+        <w:rFonts w:ascii="Symbol" w:hAnsi="Symbol" w:hint="default"/>
+      </w:rPr>
+    </w:lvl>
+    <w:lvl w:ilvl="1" w:tplc="080A0003" w:tentative="1">
+      <w:start w:val="1"/>
+      <w:numFmt w:val="bullet"/>
+      <w:lvlText w:val="o"/>
+      <w:lvlJc w:val="left"/>
+      <w:pPr>
+        <w:ind w:left="1440" w:hanging="360"/>
+      </w:pPr>
+      <w:rPr>
+        <w:rFonts w:ascii="Courier New" w:hAnsi="Courier New" w:cs="Courier New" w:hint="default"/>
+      </w:rPr>
+    </w:lvl>
+    <w:lvl w:ilvl="2" w:tplc="080A0005" w:tentative="1">
+      <w:start w:val="1"/>
+      <w:numFmt w:val="bullet"/>
+      <w:lvlText w:val=""/>
+      <w:lvlJc w:val="left"/>
+      <w:pPr>
+        <w:ind w:left="2160" w:hanging="360"/>
+      </w:pPr>
+      <w:rPr>
+        <w:rFonts w:ascii="Wingdings" w:hAnsi="Wingdings" w:hint="default"/>
+      </w:rPr>
+    </w:lvl>
+    <w:lvl w:ilvl="3" w:tplc="080A0001" w:tentative="1">
+      <w:start w:val="1"/>
+      <w:numFmt w:val="bullet"/>
+      <w:lvlText w:val=""/>
+      <w:lvlJc w:val="left"/>
+      <w:pPr>
+        <w:ind w:left="2880" w:hanging="360"/>
+      </w:pPr>
+      <w:rPr>
+        <w:rFonts w:ascii="Symbol" w:hAnsi="Symbol" w:hint="default"/>
+      </w:rPr>
+    </w:lvl>
+    <w:lvl w:ilvl="4" w:tplc="080A0003" w:tentative="1">
+      <w:start w:val="1"/>
+      <w:numFmt w:val="bullet"/>
+      <w:lvlText w:val="o"/>
+      <w:lvlJc w:val="left"/>
+      <w:pPr>
+        <w:ind w:left="3600" w:hanging="360"/>
+      </w:pPr>
+      <w:rPr>
+        <w:rFonts w:ascii="Courier New" w:hAnsi="Courier New" w:cs="Courier New" w:hint="default"/>
+      </w:rPr>
+    </w:lvl>
+    <w:lvl w:ilvl="5" w:tplc="080A0005" w:tentative="1">
+      <w:start w:val="1"/>
+      <w:numFmt w:val="bullet"/>
+      <w:lvlText w:val=""/>
+      <w:lvlJc w:val="left"/>
+      <w:pPr>
+        <w:ind w:left="4320" w:hanging="360"/>
+      </w:pPr>
+      <w:rPr>
+        <w:rFonts w:ascii="Wingdings" w:hAnsi="Wingdings" w:hint="default"/>
+      </w:rPr>
+    </w:lvl>
+    <w:lvl w:ilvl="6" w:tplc="080A0001" w:tentative="1">
+      <w:start w:val="1"/>
+      <w:numFmt w:val="bullet"/>
+      <w:lvlText w:val=""/>
+      <w:lvlJc w:val="left"/>
+      <w:pPr>
+        <w:ind w:left="5040" w:hanging="360"/>
+      </w:pPr>
+      <w:rPr>
+        <w:rFonts w:ascii="Symbol" w:hAnsi="Symbol" w:hint="default"/>
+      </w:rPr>
+    </w:lvl>
+    <w:lvl w:ilvl="7" w:tplc="080A0003" w:tentative="1">
+      <w:start w:val="1"/>
+      <w:numFmt w:val="bullet"/>
+      <w:lvlText w:val="o"/>
+      <w:lvlJc w:val="left"/>
+      <w:pPr>
+        <w:ind w:left="5760" w:hanging="360"/>
+      </w:pPr>
+      <w:rPr>
+        <w:rFonts w:ascii="Courier New" w:hAnsi="Courier New" w:cs="Courier New" w:hint="default"/>
+      </w:rPr>
+    </w:lvl>
+    <w:lvl w:ilvl="8" w:tplc="080A0005" w:tentative="1">
+      <w:start w:val="1"/>
+      <w:numFmt w:val="bullet"/>
+      <w:lvlText w:val=""/>
+      <w:lvlJc w:val="left"/>
+      <w:pPr>
+        <w:ind w:left="6480" w:hanging="360"/>
+      </w:pPr>
+      <w:rPr>
+        <w:rFonts w:ascii="Wingdings" w:hAnsi="Wingdings" w:hint="default"/>
+      </w:rPr>
+    </w:lvl>
+  </w:abstractNum>
+  <w:abstractNum w:abstractNumId="1" w15:restartNumberingAfterBreak="0">
     <w:nsid w:val="268B6701"/>
     <w:multiLevelType w:val="multilevel"/>
     <w:tmpl w:val="BB0C679A"/>
@@ -6418,7 +7044,7 @@
       </w:rPr>
     </w:lvl>
   </w:abstractNum>
-  <w:abstractNum w:abstractNumId="1" w15:restartNumberingAfterBreak="0">
+  <w:abstractNum w:abstractNumId="2" w15:restartNumberingAfterBreak="0">
     <w:nsid w:val="2B470834"/>
     <w:multiLevelType w:val="multilevel"/>
     <w:tmpl w:val="DE0ADCB6"/>
@@ -6567,7 +7193,7 @@
       </w:rPr>
     </w:lvl>
   </w:abstractNum>
-  <w:abstractNum w:abstractNumId="2" w15:restartNumberingAfterBreak="0">
+  <w:abstractNum w:abstractNumId="3" w15:restartNumberingAfterBreak="0">
     <w:nsid w:val="500E7784"/>
     <w:multiLevelType w:val="multilevel"/>
     <w:tmpl w:val="880CAE6A"/>
@@ -6716,7 +7342,7 @@
       </w:rPr>
     </w:lvl>
   </w:abstractNum>
-  <w:abstractNum w:abstractNumId="3" w15:restartNumberingAfterBreak="0">
+  <w:abstractNum w:abstractNumId="4" w15:restartNumberingAfterBreak="0">
     <w:nsid w:val="6C683245"/>
     <w:multiLevelType w:val="multilevel"/>
     <w:tmpl w:val="7F36BB6A"/>
@@ -6866,16 +7492,19 @@
     </w:lvl>
   </w:abstractNum>
   <w:num w:numId="1" w16cid:durableId="9720664">
-    <w:abstractNumId w:val="0"/>
+    <w:abstractNumId w:val="1"/>
   </w:num>
   <w:num w:numId="2" w16cid:durableId="2069919673">
-    <w:abstractNumId w:val="1"/>
+    <w:abstractNumId w:val="2"/>
   </w:num>
   <w:num w:numId="3" w16cid:durableId="1686975180">
-    <w:abstractNumId w:val="2"/>
+    <w:abstractNumId w:val="3"/>
   </w:num>
   <w:num w:numId="4" w16cid:durableId="717051359">
-    <w:abstractNumId w:val="3"/>
+    <w:abstractNumId w:val="4"/>
+  </w:num>
+  <w:num w:numId="5" w16cid:durableId="1964462465">
+    <w:abstractNumId w:val="0"/>
   </w:num>
 </w:numbering>
 </file>

</xml_diff>